<commit_message>
Stable preview: siudi working, spinner ok #2
</commit_message>
<xml_diff>
--- a/app/docx_templates/menora_siudi.docx
+++ b/app/docx_templates/menora_siudi.docx
@@ -58,7 +58,7 @@
           <w:lang w:eastAsia="he-IL" w:bidi="he-IL"/>
           <w14:ligatures w14:val="none"/>
         </w:rPr>
-        <w:t>{{ case.report_date }}</w:t>
+        <w:t>{{ now }}</w:t>
       </w:r>
     </w:p>
     <w:p>
@@ -172,7 +172,7 @@
           <w:lang w:eastAsia="he-IL" w:bidi="he-IL"/>
           <w14:ligatures w14:val="none"/>
         </w:rPr>
-        <w:t>{{ case.ref }}</w:t>
+        <w:t>{{ db.ref_number }}</w:t>
       </w:r>
     </w:p>
     <w:p>
@@ -523,7 +523,7 @@
           <w:lang w:eastAsia="he-IL" w:bidi="he-IL"/>
           <w14:ligatures w14:val="none"/>
         </w:rPr>
-        <w:t>{{ insured.name }}</w:t>
+        <w:t>{{ db.full_name }}</w:t>
       </w:r>
     </w:p>
     <w:p>
@@ -622,7 +622,7 @@
           <w:lang w:eastAsia="he-IL" w:bidi="he-IL"/>
           <w14:ligatures w14:val="none"/>
         </w:rPr>
-        <w:t>{{ insured.id }}</w:t>
+        <w:t>{{ db.id_number }}</w:t>
       </w:r>
     </w:p>
     <w:p>
@@ -721,7 +721,7 @@
           <w:lang w:eastAsia="he-IL" w:bidi="he-IL"/>
           <w14:ligatures w14:val="none"/>
         </w:rPr>
-        <w:t>{{ case.claim_number }}</w:t>
+        <w:t>{{ db.claim_number }}</w:t>
       </w:r>
       <w:r>
         <w:rPr>
@@ -868,7 +868,7 @@
           <w:lang w:eastAsia="he-IL" w:bidi="he-IL"/>
           <w14:ligatures w14:val="none"/>
         </w:rPr>
-        <w:t>{{ insured.injury_type|default('') }}</w:t>
+        <w:t>{{ db.injury_type|default('') }}</w:t>
       </w:r>
     </w:p>
     <w:p>
@@ -1010,7 +1010,7 @@
           <w:szCs w:val="26"/>
           <w:lang w:bidi="he-IL"/>
         </w:rPr>
-        <w:t>{{ insured.name }}</w:t>
+        <w:t>{{ db.full_name }}</w:t>
       </w:r>
       <w:r>
         <w:rPr>
@@ -1058,7 +1058,7 @@
           <w:szCs w:val="26"/>
           <w:lang w:bidi="he-IL"/>
         </w:rPr>
-        <w:t>{{ insured.dob|default('') }}</w:t>
+        <w:t>{{ db.birth_date }}</w:t>
       </w:r>
       <w:r>
         <w:rPr>
@@ -1186,7 +1186,7 @@
           <w:szCs w:val="26"/>
           <w:lang w:bidi="he-IL"/>
         </w:rPr>
-        <w:t>{{ case.activity_date|default('') }}</w:t>
+        <w:t>{{ ctx.activity_date }}</w:t>
       </w:r>
       <w:r>
         <w:rPr>
@@ -1338,7 +1338,7 @@
           <w:szCs w:val="26"/>
           <w:lang w:bidi="he-IL"/>
         </w:rPr>
-        <w:t>{{ case.activity_date|default('') }}</w:t>
+        <w:t>{{ ctx.activity_date }}</w:t>
       </w:r>
       <w:r>
         <w:rPr>
@@ -1377,7 +1377,7 @@
           <w:szCs w:val="26"/>
           <w:lang w:bidi="he-IL"/>
         </w:rPr>
-        <w:t>{{ surveillance.place|default('') }}</w:t>
+        <w:t>{{ ctx.surv_place }}</w:t>
       </w:r>
       <w:r>
         <w:rPr>
@@ -1396,7 +1396,7 @@
           <w:szCs w:val="26"/>
           <w:lang w:bidi="he-IL"/>
         </w:rPr>
-        <w:t>{{ surveillance.city|default('') }}</w:t>
+        <w:t>{{ ctx.surv_city }}</w:t>
       </w:r>
       <w:r>
         <w:rPr>

</xml_diff>

<commit_message>
Stable preview: siudi working, spinner ok #5
</commit_message>
<xml_diff>
--- a/app/docx_templates/menora_siudi.docx
+++ b/app/docx_templates/menora_siudi.docx
@@ -47,18 +47,33 @@
         </w:rPr>
         <w:t xml:space="preserve"> </w:t>
       </w:r>
-      <w:r>
-        <w:rPr>
-          <w:rFonts w:ascii="Arial" w:eastAsia="Times New Roman" w:hAnsi="Arial" w:cs="Arial"/>
-          <w:b/>
-          <w:bCs/>
-          <w:kern w:val="0"/>
-          <w:sz w:val="26"/>
-          <w:szCs w:val="26"/>
-          <w:lang w:eastAsia="he-IL" w:bidi="he-IL"/>
-          <w14:ligatures w14:val="none"/>
-        </w:rPr>
-        <w:t>{{ now }}</w:t>
+      <w:proofErr w:type="gramStart"/>
+      <w:r>
+        <w:rPr>
+          <w:rFonts w:ascii="Arial" w:eastAsia="Times New Roman" w:hAnsi="Arial" w:cs="Arial"/>
+          <w:b/>
+          <w:bCs/>
+          <w:kern w:val="0"/>
+          <w:sz w:val="26"/>
+          <w:szCs w:val="26"/>
+          <w:lang w:eastAsia="he-IL" w:bidi="he-IL"/>
+          <w14:ligatures w14:val="none"/>
+        </w:rPr>
+        <w:t>{{ now</w:t>
+      </w:r>
+      <w:proofErr w:type="gramEnd"/>
+      <w:r>
+        <w:rPr>
+          <w:rFonts w:ascii="Arial" w:eastAsia="Times New Roman" w:hAnsi="Arial" w:cs="Arial"/>
+          <w:b/>
+          <w:bCs/>
+          <w:kern w:val="0"/>
+          <w:sz w:val="26"/>
+          <w:szCs w:val="26"/>
+          <w:lang w:eastAsia="he-IL" w:bidi="he-IL"/>
+          <w14:ligatures w14:val="none"/>
+        </w:rPr>
+        <w:t xml:space="preserve"> }}</w:t>
       </w:r>
     </w:p>
     <w:p>
@@ -172,7 +187,35 @@
           <w:lang w:eastAsia="he-IL" w:bidi="he-IL"/>
           <w14:ligatures w14:val="none"/>
         </w:rPr>
-        <w:t>{{ db.ref_number }}</w:t>
+        <w:t xml:space="preserve">{{ </w:t>
+      </w:r>
+      <w:proofErr w:type="spellStart"/>
+      <w:r>
+        <w:rPr>
+          <w:rFonts w:ascii="Arial" w:eastAsia="Times New Roman" w:hAnsi="Arial" w:cs="Arial"/>
+          <w:b/>
+          <w:bCs/>
+          <w:kern w:val="0"/>
+          <w:sz w:val="26"/>
+          <w:szCs w:val="26"/>
+          <w:lang w:eastAsia="he-IL" w:bidi="he-IL"/>
+          <w14:ligatures w14:val="none"/>
+        </w:rPr>
+        <w:t>db.ref_number</w:t>
+      </w:r>
+      <w:proofErr w:type="spellEnd"/>
+      <w:r>
+        <w:rPr>
+          <w:rFonts w:ascii="Arial" w:eastAsia="Times New Roman" w:hAnsi="Arial" w:cs="Arial"/>
+          <w:b/>
+          <w:bCs/>
+          <w:kern w:val="0"/>
+          <w:sz w:val="26"/>
+          <w:szCs w:val="26"/>
+          <w:lang w:eastAsia="he-IL" w:bidi="he-IL"/>
+          <w14:ligatures w14:val="none"/>
+        </w:rPr>
+        <w:t xml:space="preserve"> }}</w:t>
       </w:r>
     </w:p>
     <w:p>
@@ -523,7 +566,31 @@
           <w:lang w:eastAsia="he-IL" w:bidi="he-IL"/>
           <w14:ligatures w14:val="none"/>
         </w:rPr>
-        <w:t>{{ db.full_name }}</w:t>
+        <w:t xml:space="preserve">{{ </w:t>
+      </w:r>
+      <w:proofErr w:type="spellStart"/>
+      <w:r>
+        <w:rPr>
+          <w:rFonts w:ascii="Arial" w:eastAsia="Times New Roman" w:hAnsi="Arial" w:cs="Arial"/>
+          <w:kern w:val="0"/>
+          <w:sz w:val="26"/>
+          <w:szCs w:val="26"/>
+          <w:lang w:eastAsia="he-IL" w:bidi="he-IL"/>
+          <w14:ligatures w14:val="none"/>
+        </w:rPr>
+        <w:t>db.full_name</w:t>
+      </w:r>
+      <w:proofErr w:type="spellEnd"/>
+      <w:r>
+        <w:rPr>
+          <w:rFonts w:ascii="Arial" w:eastAsia="Times New Roman" w:hAnsi="Arial" w:cs="Arial"/>
+          <w:kern w:val="0"/>
+          <w:sz w:val="26"/>
+          <w:szCs w:val="26"/>
+          <w:lang w:eastAsia="he-IL" w:bidi="he-IL"/>
+          <w14:ligatures w14:val="none"/>
+        </w:rPr>
+        <w:t xml:space="preserve"> }}</w:t>
       </w:r>
     </w:p>
     <w:p>
@@ -622,7 +689,31 @@
           <w:lang w:eastAsia="he-IL" w:bidi="he-IL"/>
           <w14:ligatures w14:val="none"/>
         </w:rPr>
-        <w:t>{{ db.id_number }}</w:t>
+        <w:t xml:space="preserve">{{ </w:t>
+      </w:r>
+      <w:proofErr w:type="spellStart"/>
+      <w:r>
+        <w:rPr>
+          <w:rFonts w:ascii="Arial" w:eastAsia="Times New Roman" w:hAnsi="Arial" w:cs="Arial"/>
+          <w:kern w:val="0"/>
+          <w:sz w:val="26"/>
+          <w:szCs w:val="26"/>
+          <w:lang w:eastAsia="he-IL" w:bidi="he-IL"/>
+          <w14:ligatures w14:val="none"/>
+        </w:rPr>
+        <w:t>db.id_number</w:t>
+      </w:r>
+      <w:proofErr w:type="spellEnd"/>
+      <w:r>
+        <w:rPr>
+          <w:rFonts w:ascii="Arial" w:eastAsia="Times New Roman" w:hAnsi="Arial" w:cs="Arial"/>
+          <w:kern w:val="0"/>
+          <w:sz w:val="26"/>
+          <w:szCs w:val="26"/>
+          <w:lang w:eastAsia="he-IL" w:bidi="he-IL"/>
+          <w14:ligatures w14:val="none"/>
+        </w:rPr>
+        <w:t xml:space="preserve"> }}</w:t>
       </w:r>
     </w:p>
     <w:p>
@@ -721,7 +812,31 @@
           <w:lang w:eastAsia="he-IL" w:bidi="he-IL"/>
           <w14:ligatures w14:val="none"/>
         </w:rPr>
-        <w:t>{{ db.claim_number }}</w:t>
+        <w:t xml:space="preserve">{{ </w:t>
+      </w:r>
+      <w:proofErr w:type="spellStart"/>
+      <w:r>
+        <w:rPr>
+          <w:rFonts w:ascii="Arial" w:eastAsia="Times New Roman" w:hAnsi="Arial" w:cs="Arial"/>
+          <w:kern w:val="0"/>
+          <w:sz w:val="26"/>
+          <w:szCs w:val="26"/>
+          <w:lang w:eastAsia="he-IL" w:bidi="he-IL"/>
+          <w14:ligatures w14:val="none"/>
+        </w:rPr>
+        <w:t>db.claim_number</w:t>
+      </w:r>
+      <w:proofErr w:type="spellEnd"/>
+      <w:r>
+        <w:rPr>
+          <w:rFonts w:ascii="Arial" w:eastAsia="Times New Roman" w:hAnsi="Arial" w:cs="Arial"/>
+          <w:kern w:val="0"/>
+          <w:sz w:val="26"/>
+          <w:szCs w:val="26"/>
+          <w:lang w:eastAsia="he-IL" w:bidi="he-IL"/>
+          <w14:ligatures w14:val="none"/>
+        </w:rPr>
+        <w:t xml:space="preserve"> }}</w:t>
       </w:r>
       <w:r>
         <w:rPr>
@@ -868,7 +983,55 @@
           <w:lang w:eastAsia="he-IL" w:bidi="he-IL"/>
           <w14:ligatures w14:val="none"/>
         </w:rPr>
-        <w:t>{{ ctx.injury_type or db.injury_type }}</w:t>
+        <w:t xml:space="preserve">{{ </w:t>
+      </w:r>
+      <w:proofErr w:type="spellStart"/>
+      <w:r>
+        <w:rPr>
+          <w:rFonts w:ascii="Arial" w:eastAsia="Times New Roman" w:hAnsi="Arial" w:cs="Arial"/>
+          <w:kern w:val="0"/>
+          <w:sz w:val="26"/>
+          <w:szCs w:val="26"/>
+          <w:lang w:eastAsia="he-IL" w:bidi="he-IL"/>
+          <w14:ligatures w14:val="none"/>
+        </w:rPr>
+        <w:t>ctx.injury_type</w:t>
+      </w:r>
+      <w:proofErr w:type="spellEnd"/>
+      <w:r>
+        <w:rPr>
+          <w:rFonts w:ascii="Arial" w:eastAsia="Times New Roman" w:hAnsi="Arial" w:cs="Arial"/>
+          <w:kern w:val="0"/>
+          <w:sz w:val="26"/>
+          <w:szCs w:val="26"/>
+          <w:lang w:eastAsia="he-IL" w:bidi="he-IL"/>
+          <w14:ligatures w14:val="none"/>
+        </w:rPr>
+        <w:t xml:space="preserve"> or </w:t>
+      </w:r>
+      <w:proofErr w:type="spellStart"/>
+      <w:r>
+        <w:rPr>
+          <w:rFonts w:ascii="Arial" w:eastAsia="Times New Roman" w:hAnsi="Arial" w:cs="Arial"/>
+          <w:kern w:val="0"/>
+          <w:sz w:val="26"/>
+          <w:szCs w:val="26"/>
+          <w:lang w:eastAsia="he-IL" w:bidi="he-IL"/>
+          <w14:ligatures w14:val="none"/>
+        </w:rPr>
+        <w:t>db.injury_type</w:t>
+      </w:r>
+      <w:proofErr w:type="spellEnd"/>
+      <w:r>
+        <w:rPr>
+          <w:rFonts w:ascii="Arial" w:eastAsia="Times New Roman" w:hAnsi="Arial" w:cs="Arial"/>
+          <w:kern w:val="0"/>
+          <w:sz w:val="26"/>
+          <w:szCs w:val="26"/>
+          <w:lang w:eastAsia="he-IL" w:bidi="he-IL"/>
+          <w14:ligatures w14:val="none"/>
+        </w:rPr>
+        <w:t xml:space="preserve"> }}</w:t>
       </w:r>
     </w:p>
     <w:p>
@@ -1010,7 +1173,27 @@
           <w:szCs w:val="26"/>
           <w:lang w:bidi="he-IL"/>
         </w:rPr>
-        <w:t>{{ db.full_name }}</w:t>
+        <w:t xml:space="preserve">{{ </w:t>
+      </w:r>
+      <w:proofErr w:type="spellStart"/>
+      <w:r>
+        <w:rPr>
+          <w:rFonts w:ascii="Arial" w:hAnsi="Arial" w:cs="Arial"/>
+          <w:sz w:val="26"/>
+          <w:szCs w:val="26"/>
+          <w:lang w:bidi="he-IL"/>
+        </w:rPr>
+        <w:t>db.full_name</w:t>
+      </w:r>
+      <w:proofErr w:type="spellEnd"/>
+      <w:r>
+        <w:rPr>
+          <w:rFonts w:ascii="Arial" w:hAnsi="Arial" w:cs="Arial"/>
+          <w:sz w:val="26"/>
+          <w:szCs w:val="26"/>
+          <w:lang w:bidi="he-IL"/>
+        </w:rPr>
+        <w:t xml:space="preserve"> }}</w:t>
       </w:r>
       <w:r>
         <w:rPr>
@@ -1053,21 +1236,51 @@
       </w:r>
       <w:r>
         <w:rPr>
-          <w:rFonts w:ascii="Arial" w:hAnsi="Arial" w:cs="Arial"/>
-          <w:sz w:val="26"/>
-          <w:szCs w:val="26"/>
-          <w:lang w:bidi="he-IL"/>
-        </w:rPr>
-        <w:t>{{ db.birth_date }}</w:t>
-      </w:r>
-      <w:r>
-        <w:rPr>
           <w:rFonts w:ascii="Arial" w:hAnsi="Arial" w:cs="Arial" w:hint="cs"/>
           <w:sz w:val="26"/>
           <w:szCs w:val="26"/>
           <w:rtl/>
           <w:lang w:bidi="he-IL"/>
         </w:rPr>
+        <w:t xml:space="preserve"> </w:t>
+      </w:r>
+      <w:r>
+        <w:rPr>
+          <w:rFonts w:ascii="Arial" w:hAnsi="Arial" w:cs="Arial"/>
+          <w:sz w:val="26"/>
+          <w:szCs w:val="26"/>
+          <w:lang w:bidi="he-IL"/>
+        </w:rPr>
+        <w:t xml:space="preserve">{{ </w:t>
+      </w:r>
+      <w:proofErr w:type="spellStart"/>
+      <w:r>
+        <w:rPr>
+          <w:rFonts w:ascii="Arial" w:hAnsi="Arial" w:cs="Arial"/>
+          <w:sz w:val="26"/>
+          <w:szCs w:val="26"/>
+          <w:lang w:bidi="he-IL"/>
+        </w:rPr>
+        <w:t>db.birth_year</w:t>
+      </w:r>
+      <w:proofErr w:type="spellEnd"/>
+      <w:r>
+        <w:rPr>
+          <w:rFonts w:ascii="Arial" w:hAnsi="Arial" w:cs="Arial"/>
+          <w:sz w:val="26"/>
+          <w:szCs w:val="26"/>
+          <w:lang w:bidi="he-IL"/>
+        </w:rPr>
+        <w:t xml:space="preserve"> }}</w:t>
+      </w:r>
+      <w:r>
+        <w:rPr>
+          <w:rFonts w:ascii="Arial" w:hAnsi="Arial" w:cs="Arial" w:hint="cs"/>
+          <w:sz w:val="26"/>
+          <w:szCs w:val="26"/>
+          <w:rtl/>
+          <w:lang w:bidi="he-IL"/>
+        </w:rPr>
         <w:t>, אשר טוען למצב סיעודי.</w:t>
       </w:r>
       <w:r>
@@ -1109,6 +1322,16 @@
           <w:lang w:bidi="he-IL"/>
         </w:rPr>
         <w:t>פעלנו בהתאם</w:t>
+      </w:r>
+      <w:r>
+        <w:rPr>
+          <w:rFonts w:ascii="Arial" w:hAnsi="Arial" w:cs="Arial" w:hint="cs"/>
+          <w:sz w:val="26"/>
+          <w:szCs w:val="26"/>
+          <w:rtl/>
+          <w:lang w:bidi="he-IL"/>
+        </w:rPr>
+        <w:t>.</w:t>
       </w:r>
     </w:p>
     <w:p>
@@ -1186,7 +1409,27 @@
           <w:szCs w:val="26"/>
           <w:lang w:bidi="he-IL"/>
         </w:rPr>
-        <w:t>{{ ctx.activity_date }}</w:t>
+        <w:t xml:space="preserve">{{ </w:t>
+      </w:r>
+      <w:proofErr w:type="spellStart"/>
+      <w:r>
+        <w:rPr>
+          <w:rFonts w:ascii="Arial" w:hAnsi="Arial" w:cs="Arial"/>
+          <w:sz w:val="26"/>
+          <w:szCs w:val="26"/>
+          <w:lang w:bidi="he-IL"/>
+        </w:rPr>
+        <w:t>ctx.activity_date_dots</w:t>
+      </w:r>
+      <w:proofErr w:type="spellEnd"/>
+      <w:r>
+        <w:rPr>
+          <w:rFonts w:ascii="Arial" w:hAnsi="Arial" w:cs="Arial"/>
+          <w:sz w:val="26"/>
+          <w:szCs w:val="26"/>
+          <w:lang w:bidi="he-IL"/>
+        </w:rPr>
+        <w:t xml:space="preserve"> }}</w:t>
       </w:r>
       <w:r>
         <w:rPr>
@@ -1264,6 +1507,40 @@
         </w:rPr>
         <w:t xml:space="preserve"> </w:t>
       </w:r>
+    </w:p>
+    <w:p>
+      <w:pPr>
+        <w:rPr>
+          <w:rFonts w:ascii="Arial" w:hAnsi="Arial" w:cs="Arial"/>
+          <w:sz w:val="26"/>
+          <w:szCs w:val="26"/>
+          <w:rtl/>
+          <w:lang w:bidi="he-IL"/>
+        </w:rPr>
+      </w:pPr>
+      <w:r>
+        <w:rPr>
+          <w:rFonts w:ascii="Arial" w:hAnsi="Arial" w:cs="Arial"/>
+          <w:sz w:val="26"/>
+          <w:szCs w:val="26"/>
+          <w:rtl/>
+          <w:lang w:bidi="he-IL"/>
+        </w:rPr>
+        <w:br w:type="page"/>
+      </w:r>
+    </w:p>
+    <w:p>
+      <w:pPr>
+        <w:bidi/>
+        <w:spacing w:line="360" w:lineRule="auto"/>
+        <w:rPr>
+          <w:rFonts w:ascii="Arial" w:hAnsi="Arial" w:cs="Arial"/>
+          <w:sz w:val="26"/>
+          <w:szCs w:val="26"/>
+          <w:rtl/>
+          <w:lang w:bidi="he-IL"/>
+        </w:rPr>
+      </w:pPr>
     </w:p>
     <w:p>
       <w:pPr>
@@ -1333,21 +1610,51 @@
       </w:r>
       <w:r>
         <w:rPr>
-          <w:rFonts w:ascii="Arial" w:hAnsi="Arial" w:cs="Arial"/>
-          <w:sz w:val="26"/>
-          <w:szCs w:val="26"/>
-          <w:lang w:bidi="he-IL"/>
-        </w:rPr>
-        <w:t>{{ ctx.activity_date }}</w:t>
-      </w:r>
-      <w:r>
-        <w:rPr>
           <w:rFonts w:ascii="Arial" w:hAnsi="Arial" w:cs="Arial" w:hint="cs"/>
           <w:sz w:val="26"/>
           <w:szCs w:val="26"/>
           <w:rtl/>
           <w:lang w:bidi="he-IL"/>
         </w:rPr>
+        <w:t xml:space="preserve"> </w:t>
+      </w:r>
+      <w:r>
+        <w:rPr>
+          <w:rFonts w:ascii="Arial" w:hAnsi="Arial" w:cs="Arial"/>
+          <w:sz w:val="26"/>
+          <w:szCs w:val="26"/>
+          <w:lang w:bidi="he-IL"/>
+        </w:rPr>
+        <w:t xml:space="preserve">{{ </w:t>
+      </w:r>
+      <w:proofErr w:type="spellStart"/>
+      <w:r>
+        <w:rPr>
+          <w:rFonts w:ascii="Arial" w:hAnsi="Arial" w:cs="Arial"/>
+          <w:sz w:val="26"/>
+          <w:szCs w:val="26"/>
+          <w:lang w:bidi="he-IL"/>
+        </w:rPr>
+        <w:t>ctx.activity_date_dots</w:t>
+      </w:r>
+      <w:proofErr w:type="spellEnd"/>
+      <w:r>
+        <w:rPr>
+          <w:rFonts w:ascii="Arial" w:hAnsi="Arial" w:cs="Arial"/>
+          <w:sz w:val="26"/>
+          <w:szCs w:val="26"/>
+          <w:lang w:bidi="he-IL"/>
+        </w:rPr>
+        <w:t xml:space="preserve"> }}</w:t>
+      </w:r>
+      <w:r>
+        <w:rPr>
+          <w:rFonts w:ascii="Arial" w:hAnsi="Arial" w:cs="Arial" w:hint="cs"/>
+          <w:sz w:val="26"/>
+          <w:szCs w:val="26"/>
+          <w:rtl/>
+          <w:lang w:bidi="he-IL"/>
+        </w:rPr>
         <w:t>.</w:t>
       </w:r>
       <w:r>
@@ -1372,31 +1679,91 @@
       </w:r>
       <w:r>
         <w:rPr>
-          <w:rFonts w:ascii="Arial" w:hAnsi="Arial" w:cs="Arial"/>
-          <w:sz w:val="26"/>
-          <w:szCs w:val="26"/>
-          <w:lang w:bidi="he-IL"/>
-        </w:rPr>
-        <w:t>{{ ctx.surv_place }}</w:t>
-      </w:r>
-      <w:r>
-        <w:rPr>
           <w:rFonts w:ascii="Arial" w:hAnsi="Arial" w:cs="Arial" w:hint="cs"/>
           <w:sz w:val="26"/>
           <w:szCs w:val="26"/>
           <w:rtl/>
           <w:lang w:bidi="he-IL"/>
         </w:rPr>
+        <w:t xml:space="preserve"> ב</w:t>
+      </w:r>
+      <w:r>
+        <w:rPr>
+          <w:rFonts w:ascii="Arial" w:hAnsi="Arial" w:cs="Arial"/>
+          <w:sz w:val="26"/>
+          <w:szCs w:val="26"/>
+          <w:lang w:bidi="he-IL"/>
+        </w:rPr>
+        <w:t xml:space="preserve">{{ </w:t>
+      </w:r>
+      <w:proofErr w:type="spellStart"/>
+      <w:r>
+        <w:rPr>
+          <w:rFonts w:ascii="Arial" w:hAnsi="Arial" w:cs="Arial"/>
+          <w:sz w:val="26"/>
+          <w:szCs w:val="26"/>
+          <w:lang w:bidi="he-IL"/>
+        </w:rPr>
+        <w:t>ctx.surv_place</w:t>
+      </w:r>
+      <w:proofErr w:type="spellEnd"/>
+      <w:r>
+        <w:rPr>
+          <w:rFonts w:ascii="Arial" w:hAnsi="Arial" w:cs="Arial"/>
+          <w:sz w:val="26"/>
+          <w:szCs w:val="26"/>
+          <w:lang w:bidi="he-IL"/>
+        </w:rPr>
+        <w:t xml:space="preserve"> }}</w:t>
+      </w:r>
+      <w:r>
+        <w:rPr>
+          <w:rFonts w:ascii="Arial" w:hAnsi="Arial" w:cs="Arial" w:hint="cs"/>
+          <w:sz w:val="26"/>
+          <w:szCs w:val="26"/>
+          <w:rtl/>
+          <w:lang w:bidi="he-IL"/>
+        </w:rPr>
         <w:t>,</w:t>
       </w:r>
       <w:r>
         <w:rPr>
-          <w:rFonts w:ascii="Arial" w:hAnsi="Arial" w:cs="Arial"/>
-          <w:sz w:val="26"/>
-          <w:szCs w:val="26"/>
-          <w:lang w:bidi="he-IL"/>
-        </w:rPr>
-        <w:t>{{ ctx.surv_city }}</w:t>
+          <w:rFonts w:ascii="Arial" w:hAnsi="Arial" w:cs="Arial" w:hint="cs"/>
+          <w:sz w:val="26"/>
+          <w:szCs w:val="26"/>
+          <w:rtl/>
+          <w:lang w:bidi="he-IL"/>
+        </w:rPr>
+        <w:t xml:space="preserve"> ב</w:t>
+      </w:r>
+      <w:r>
+        <w:rPr>
+          <w:rFonts w:ascii="Arial" w:hAnsi="Arial" w:cs="Arial"/>
+          <w:sz w:val="26"/>
+          <w:szCs w:val="26"/>
+          <w:lang w:bidi="he-IL"/>
+        </w:rPr>
+        <w:t xml:space="preserve">{{ </w:t>
+      </w:r>
+      <w:proofErr w:type="spellStart"/>
+      <w:r>
+        <w:rPr>
+          <w:rFonts w:ascii="Arial" w:hAnsi="Arial" w:cs="Arial"/>
+          <w:sz w:val="26"/>
+          <w:szCs w:val="26"/>
+          <w:lang w:bidi="he-IL"/>
+        </w:rPr>
+        <w:t>ctx.surv_city</w:t>
+      </w:r>
+      <w:proofErr w:type="spellEnd"/>
+      <w:r>
+        <w:rPr>
+          <w:rFonts w:ascii="Arial" w:hAnsi="Arial" w:cs="Arial"/>
+          <w:sz w:val="26"/>
+          <w:szCs w:val="26"/>
+          <w:lang w:bidi="he-IL"/>
+        </w:rPr>
+        <w:t xml:space="preserve"> }}</w:t>
       </w:r>
       <w:r>
         <w:rPr>
@@ -1869,11 +2236,6 @@
         <w:docPartUnique/>
       </w:docPartObj>
     </w:sdtPr>
-    <w:sdtEndPr>
-      <w:rPr>
-        <w:rStyle w:val="PageNumber"/>
-      </w:rPr>
-    </w:sdtEndPr>
     <w:sdtContent>
       <w:p>
         <w:pPr>
@@ -3592,6 +3954,7 @@
   <w:style w:type="character" w:default="1" w:styleId="DefaultParagraphFont">
     <w:name w:val="Default Paragraph Font"/>
     <w:uiPriority w:val="1"/>
+    <w:semiHidden/>
     <w:unhideWhenUsed/>
   </w:style>
   <w:style w:type="table" w:default="1" w:styleId="TableNormal">

</xml_diff>

<commit_message>
Stable preview: siudi working, spinner ok #6
</commit_message>
<xml_diff>
--- a/app/docx_templates/menora_siudi.docx
+++ b/app/docx_templates/menora_siudi.docx
@@ -47,7 +47,6 @@
         </w:rPr>
         <w:t xml:space="preserve"> </w:t>
       </w:r>
-      <w:proofErr w:type="gramStart"/>
       <w:r>
         <w:rPr>
           <w:rFonts w:ascii="Arial" w:eastAsia="Times New Roman" w:hAnsi="Arial" w:cs="Arial"/>
@@ -59,21 +58,7 @@
           <w:lang w:eastAsia="he-IL" w:bidi="he-IL"/>
           <w14:ligatures w14:val="none"/>
         </w:rPr>
-        <w:t>{{ now</w:t>
-      </w:r>
-      <w:proofErr w:type="gramEnd"/>
-      <w:r>
-        <w:rPr>
-          <w:rFonts w:ascii="Arial" w:eastAsia="Times New Roman" w:hAnsi="Arial" w:cs="Arial"/>
-          <w:b/>
-          <w:bCs/>
-          <w:kern w:val="0"/>
-          <w:sz w:val="26"/>
-          <w:szCs w:val="26"/>
-          <w:lang w:eastAsia="he-IL" w:bidi="he-IL"/>
-          <w14:ligatures w14:val="none"/>
-        </w:rPr>
-        <w:t xml:space="preserve"> }}</w:t>
+        <w:t>{{ now }}</w:t>
       </w:r>
     </w:p>
     <w:p>
@@ -1240,6 +1225,15 @@
           <w:sz w:val="26"/>
           <w:szCs w:val="26"/>
           <w:rtl/>
+          <w:lang w:bidi="he-IL"/>
+        </w:rPr>
+        <w:t xml:space="preserve"> </w:t>
+      </w:r>
+      <w:r>
+        <w:rPr>
+          <w:rFonts w:ascii="Arial" w:hAnsi="Arial" w:cs="Arial"/>
+          <w:sz w:val="26"/>
+          <w:szCs w:val="26"/>
           <w:lang w:bidi="he-IL"/>
         </w:rPr>
         <w:t xml:space="preserve"> </w:t>
@@ -1537,7 +1531,6 @@
           <w:rFonts w:ascii="Arial" w:hAnsi="Arial" w:cs="Arial"/>
           <w:sz w:val="26"/>
           <w:szCs w:val="26"/>
-          <w:rtl/>
           <w:lang w:bidi="he-IL"/>
         </w:rPr>
       </w:pPr>
@@ -1694,7 +1687,7 @@
           <w:szCs w:val="26"/>
           <w:lang w:bidi="he-IL"/>
         </w:rPr>
-        <w:t xml:space="preserve">{{ </w:t>
+        <w:t>{{ ctx.su</w:t>
       </w:r>
       <w:proofErr w:type="spellStart"/>
       <w:r>
@@ -1704,7 +1697,7 @@
           <w:szCs w:val="26"/>
           <w:lang w:bidi="he-IL"/>
         </w:rPr>
-        <w:t>ctx.surv_place</w:t>
+        <w:t>rv_place</w:t>
       </w:r>
       <w:proofErr w:type="spellEnd"/>
       <w:r>

</xml_diff>

<commit_message>
Upload photos from local dropbox #2
</commit_message>
<xml_diff>
--- a/app/docx_templates/menora_siudi.docx
+++ b/app/docx_templates/menora_siudi.docx
@@ -47,6 +47,7 @@
         </w:rPr>
         <w:t xml:space="preserve"> </w:t>
       </w:r>
+      <w:proofErr w:type="gramStart"/>
       <w:r>
         <w:rPr>
           <w:rFonts w:ascii="Arial" w:eastAsia="Times New Roman" w:hAnsi="Arial" w:cs="Arial"/>
@@ -58,7 +59,21 @@
           <w:lang w:eastAsia="he-IL" w:bidi="he-IL"/>
           <w14:ligatures w14:val="none"/>
         </w:rPr>
-        <w:t>{{ now }}</w:t>
+        <w:t>{{ now</w:t>
+      </w:r>
+      <w:proofErr w:type="gramEnd"/>
+      <w:r>
+        <w:rPr>
+          <w:rFonts w:ascii="Arial" w:eastAsia="Times New Roman" w:hAnsi="Arial" w:cs="Arial"/>
+          <w:b/>
+          <w:bCs/>
+          <w:kern w:val="0"/>
+          <w:sz w:val="26"/>
+          <w:szCs w:val="26"/>
+          <w:lang w:eastAsia="he-IL" w:bidi="he-IL"/>
+          <w14:ligatures w14:val="none"/>
+        </w:rPr>
+        <w:t xml:space="preserve"> }}</w:t>
       </w:r>
     </w:p>
     <w:p>
@@ -172,7 +187,35 @@
           <w:lang w:eastAsia="he-IL" w:bidi="he-IL"/>
           <w14:ligatures w14:val="none"/>
         </w:rPr>
-        <w:t>{{ db.ref_number }}</w:t>
+        <w:t xml:space="preserve">{{ </w:t>
+      </w:r>
+      <w:proofErr w:type="spellStart"/>
+      <w:r>
+        <w:rPr>
+          <w:rFonts w:ascii="Arial" w:eastAsia="Times New Roman" w:hAnsi="Arial" w:cs="Arial"/>
+          <w:b/>
+          <w:bCs/>
+          <w:kern w:val="0"/>
+          <w:sz w:val="26"/>
+          <w:szCs w:val="26"/>
+          <w:lang w:eastAsia="he-IL" w:bidi="he-IL"/>
+          <w14:ligatures w14:val="none"/>
+        </w:rPr>
+        <w:t>db.ref_number</w:t>
+      </w:r>
+      <w:proofErr w:type="spellEnd"/>
+      <w:r>
+        <w:rPr>
+          <w:rFonts w:ascii="Arial" w:eastAsia="Times New Roman" w:hAnsi="Arial" w:cs="Arial"/>
+          <w:b/>
+          <w:bCs/>
+          <w:kern w:val="0"/>
+          <w:sz w:val="26"/>
+          <w:szCs w:val="26"/>
+          <w:lang w:eastAsia="he-IL" w:bidi="he-IL"/>
+          <w14:ligatures w14:val="none"/>
+        </w:rPr>
+        <w:t xml:space="preserve"> }}</w:t>
       </w:r>
     </w:p>
     <w:p>
@@ -523,7 +566,31 @@
           <w:lang w:eastAsia="he-IL" w:bidi="he-IL"/>
           <w14:ligatures w14:val="none"/>
         </w:rPr>
-        <w:t>{{ db.full_name }}</w:t>
+        <w:t xml:space="preserve">{{ </w:t>
+      </w:r>
+      <w:proofErr w:type="spellStart"/>
+      <w:r>
+        <w:rPr>
+          <w:rFonts w:ascii="Arial" w:eastAsia="Times New Roman" w:hAnsi="Arial" w:cs="Arial"/>
+          <w:kern w:val="0"/>
+          <w:sz w:val="26"/>
+          <w:szCs w:val="26"/>
+          <w:lang w:eastAsia="he-IL" w:bidi="he-IL"/>
+          <w14:ligatures w14:val="none"/>
+        </w:rPr>
+        <w:t>db.full_name</w:t>
+      </w:r>
+      <w:proofErr w:type="spellEnd"/>
+      <w:r>
+        <w:rPr>
+          <w:rFonts w:ascii="Arial" w:eastAsia="Times New Roman" w:hAnsi="Arial" w:cs="Arial"/>
+          <w:kern w:val="0"/>
+          <w:sz w:val="26"/>
+          <w:szCs w:val="26"/>
+          <w:lang w:eastAsia="he-IL" w:bidi="he-IL"/>
+          <w14:ligatures w14:val="none"/>
+        </w:rPr>
+        <w:t xml:space="preserve"> }}</w:t>
       </w:r>
     </w:p>
     <w:p>
@@ -622,7 +689,31 @@
           <w:lang w:eastAsia="he-IL" w:bidi="he-IL"/>
           <w14:ligatures w14:val="none"/>
         </w:rPr>
-        <w:t>{{ db.id_number }}</w:t>
+        <w:t xml:space="preserve">{{ </w:t>
+      </w:r>
+      <w:proofErr w:type="spellStart"/>
+      <w:r>
+        <w:rPr>
+          <w:rFonts w:ascii="Arial" w:eastAsia="Times New Roman" w:hAnsi="Arial" w:cs="Arial"/>
+          <w:kern w:val="0"/>
+          <w:sz w:val="26"/>
+          <w:szCs w:val="26"/>
+          <w:lang w:eastAsia="he-IL" w:bidi="he-IL"/>
+          <w14:ligatures w14:val="none"/>
+        </w:rPr>
+        <w:t>db.id_number</w:t>
+      </w:r>
+      <w:proofErr w:type="spellEnd"/>
+      <w:r>
+        <w:rPr>
+          <w:rFonts w:ascii="Arial" w:eastAsia="Times New Roman" w:hAnsi="Arial" w:cs="Arial"/>
+          <w:kern w:val="0"/>
+          <w:sz w:val="26"/>
+          <w:szCs w:val="26"/>
+          <w:lang w:eastAsia="he-IL" w:bidi="he-IL"/>
+          <w14:ligatures w14:val="none"/>
+        </w:rPr>
+        <w:t xml:space="preserve"> }}</w:t>
       </w:r>
     </w:p>
     <w:p>
@@ -721,7 +812,31 @@
           <w:lang w:eastAsia="he-IL" w:bidi="he-IL"/>
           <w14:ligatures w14:val="none"/>
         </w:rPr>
-        <w:t>{{ db.claim_number }}</w:t>
+        <w:t xml:space="preserve">{{ </w:t>
+      </w:r>
+      <w:proofErr w:type="spellStart"/>
+      <w:r>
+        <w:rPr>
+          <w:rFonts w:ascii="Arial" w:eastAsia="Times New Roman" w:hAnsi="Arial" w:cs="Arial"/>
+          <w:kern w:val="0"/>
+          <w:sz w:val="26"/>
+          <w:szCs w:val="26"/>
+          <w:lang w:eastAsia="he-IL" w:bidi="he-IL"/>
+          <w14:ligatures w14:val="none"/>
+        </w:rPr>
+        <w:t>db.claim_number</w:t>
+      </w:r>
+      <w:proofErr w:type="spellEnd"/>
+      <w:r>
+        <w:rPr>
+          <w:rFonts w:ascii="Arial" w:eastAsia="Times New Roman" w:hAnsi="Arial" w:cs="Arial"/>
+          <w:kern w:val="0"/>
+          <w:sz w:val="26"/>
+          <w:szCs w:val="26"/>
+          <w:lang w:eastAsia="he-IL" w:bidi="he-IL"/>
+          <w14:ligatures w14:val="none"/>
+        </w:rPr>
+        <w:t xml:space="preserve"> }}</w:t>
       </w:r>
       <w:r>
         <w:rPr>
@@ -868,7 +983,55 @@
           <w:lang w:eastAsia="he-IL" w:bidi="he-IL"/>
           <w14:ligatures w14:val="none"/>
         </w:rPr>
-        <w:t>{{ ctx.injury_type or db.injury_type }}</w:t>
+        <w:t xml:space="preserve">{{ </w:t>
+      </w:r>
+      <w:proofErr w:type="spellStart"/>
+      <w:r>
+        <w:rPr>
+          <w:rFonts w:ascii="Arial" w:eastAsia="Times New Roman" w:hAnsi="Arial" w:cs="Arial"/>
+          <w:kern w:val="0"/>
+          <w:sz w:val="26"/>
+          <w:szCs w:val="26"/>
+          <w:lang w:eastAsia="he-IL" w:bidi="he-IL"/>
+          <w14:ligatures w14:val="none"/>
+        </w:rPr>
+        <w:t>ctx.injury_type</w:t>
+      </w:r>
+      <w:proofErr w:type="spellEnd"/>
+      <w:r>
+        <w:rPr>
+          <w:rFonts w:ascii="Arial" w:eastAsia="Times New Roman" w:hAnsi="Arial" w:cs="Arial"/>
+          <w:kern w:val="0"/>
+          <w:sz w:val="26"/>
+          <w:szCs w:val="26"/>
+          <w:lang w:eastAsia="he-IL" w:bidi="he-IL"/>
+          <w14:ligatures w14:val="none"/>
+        </w:rPr>
+        <w:t xml:space="preserve"> or </w:t>
+      </w:r>
+      <w:proofErr w:type="spellStart"/>
+      <w:r>
+        <w:rPr>
+          <w:rFonts w:ascii="Arial" w:eastAsia="Times New Roman" w:hAnsi="Arial" w:cs="Arial"/>
+          <w:kern w:val="0"/>
+          <w:sz w:val="26"/>
+          <w:szCs w:val="26"/>
+          <w:lang w:eastAsia="he-IL" w:bidi="he-IL"/>
+          <w14:ligatures w14:val="none"/>
+        </w:rPr>
+        <w:t>db.injury_type</w:t>
+      </w:r>
+      <w:proofErr w:type="spellEnd"/>
+      <w:r>
+        <w:rPr>
+          <w:rFonts w:ascii="Arial" w:eastAsia="Times New Roman" w:hAnsi="Arial" w:cs="Arial"/>
+          <w:kern w:val="0"/>
+          <w:sz w:val="26"/>
+          <w:szCs w:val="26"/>
+          <w:lang w:eastAsia="he-IL" w:bidi="he-IL"/>
+          <w14:ligatures w14:val="none"/>
+        </w:rPr>
+        <w:t xml:space="preserve"> }}</w:t>
       </w:r>
     </w:p>
     <w:p>
@@ -1030,7 +1193,27 @@
           <w:szCs w:val="26"/>
           <w:lang w:bidi="he-IL"/>
         </w:rPr>
-        <w:t>{{ db.full_name }}</w:t>
+        <w:t xml:space="preserve">{{ </w:t>
+      </w:r>
+      <w:proofErr w:type="spellStart"/>
+      <w:r>
+        <w:rPr>
+          <w:rFonts w:ascii="Arial" w:hAnsi="Arial" w:cs="Arial"/>
+          <w:sz w:val="26"/>
+          <w:szCs w:val="26"/>
+          <w:lang w:bidi="he-IL"/>
+        </w:rPr>
+        <w:t>db.full_name</w:t>
+      </w:r>
+      <w:proofErr w:type="spellEnd"/>
+      <w:r>
+        <w:rPr>
+          <w:rFonts w:ascii="Arial" w:hAnsi="Arial" w:cs="Arial"/>
+          <w:sz w:val="26"/>
+          <w:szCs w:val="26"/>
+          <w:lang w:bidi="he-IL"/>
+        </w:rPr>
+        <w:t xml:space="preserve"> }}</w:t>
       </w:r>
       <w:r>
         <w:rPr>
@@ -1097,7 +1280,27 @@
           <w:szCs w:val="26"/>
           <w:lang w:bidi="he-IL"/>
         </w:rPr>
-        <w:t>{{ db.birth_year }}</w:t>
+        <w:t xml:space="preserve">{{ </w:t>
+      </w:r>
+      <w:proofErr w:type="spellStart"/>
+      <w:r>
+        <w:rPr>
+          <w:rFonts w:ascii="Arial" w:hAnsi="Arial" w:cs="Arial"/>
+          <w:sz w:val="26"/>
+          <w:szCs w:val="26"/>
+          <w:lang w:bidi="he-IL"/>
+        </w:rPr>
+        <w:t>db.birth_year</w:t>
+      </w:r>
+      <w:proofErr w:type="spellEnd"/>
+      <w:r>
+        <w:rPr>
+          <w:rFonts w:ascii="Arial" w:hAnsi="Arial" w:cs="Arial"/>
+          <w:sz w:val="26"/>
+          <w:szCs w:val="26"/>
+          <w:lang w:bidi="he-IL"/>
+        </w:rPr>
+        <w:t xml:space="preserve"> }}</w:t>
       </w:r>
       <w:r>
         <w:rPr>
@@ -1255,7 +1458,27 @@
           <w:szCs w:val="26"/>
           <w:lang w:bidi="he-IL"/>
         </w:rPr>
-        <w:t>{{ ctx.activity_date_dots }}</w:t>
+        <w:t xml:space="preserve">{{ </w:t>
+      </w:r>
+      <w:proofErr w:type="spellStart"/>
+      <w:r>
+        <w:rPr>
+          <w:rFonts w:ascii="Arial" w:hAnsi="Arial" w:cs="Arial"/>
+          <w:sz w:val="26"/>
+          <w:szCs w:val="26"/>
+          <w:lang w:bidi="he-IL"/>
+        </w:rPr>
+        <w:t>ctx.activity_date_dots</w:t>
+      </w:r>
+      <w:proofErr w:type="spellEnd"/>
+      <w:r>
+        <w:rPr>
+          <w:rFonts w:ascii="Arial" w:hAnsi="Arial" w:cs="Arial"/>
+          <w:sz w:val="26"/>
+          <w:szCs w:val="26"/>
+          <w:lang w:bidi="he-IL"/>
+        </w:rPr>
+        <w:t xml:space="preserve"> }}</w:t>
       </w:r>
       <w:r>
         <w:rPr>
@@ -1550,7 +1773,27 @@
           <w:szCs w:val="26"/>
           <w:lang w:bidi="he-IL"/>
         </w:rPr>
-        <w:t>{{ ctx.activity_date_dots }}</w:t>
+        <w:t xml:space="preserve">{{ </w:t>
+      </w:r>
+      <w:proofErr w:type="spellStart"/>
+      <w:r>
+        <w:rPr>
+          <w:rFonts w:ascii="Arial" w:hAnsi="Arial" w:cs="Arial"/>
+          <w:sz w:val="26"/>
+          <w:szCs w:val="26"/>
+          <w:lang w:bidi="he-IL"/>
+        </w:rPr>
+        <w:t>ctx.activity_date_dots</w:t>
+      </w:r>
+      <w:proofErr w:type="spellEnd"/>
+      <w:r>
+        <w:rPr>
+          <w:rFonts w:ascii="Arial" w:hAnsi="Arial" w:cs="Arial"/>
+          <w:sz w:val="26"/>
+          <w:szCs w:val="26"/>
+          <w:lang w:bidi="he-IL"/>
+        </w:rPr>
+        <w:t xml:space="preserve"> }}</w:t>
       </w:r>
       <w:r>
         <w:rPr>
@@ -1609,7 +1852,27 @@
           <w:szCs w:val="26"/>
           <w:lang w:bidi="he-IL"/>
         </w:rPr>
-        <w:t>{{ ctx.surv_place }}</w:t>
+        <w:t xml:space="preserve">{{ </w:t>
+      </w:r>
+      <w:proofErr w:type="spellStart"/>
+      <w:r>
+        <w:rPr>
+          <w:rFonts w:ascii="Arial" w:hAnsi="Arial" w:cs="Arial"/>
+          <w:sz w:val="26"/>
+          <w:szCs w:val="26"/>
+          <w:lang w:bidi="he-IL"/>
+        </w:rPr>
+        <w:t>ctx.surv_place</w:t>
+      </w:r>
+      <w:proofErr w:type="spellEnd"/>
+      <w:r>
+        <w:rPr>
+          <w:rFonts w:ascii="Arial" w:hAnsi="Arial" w:cs="Arial"/>
+          <w:sz w:val="26"/>
+          <w:szCs w:val="26"/>
+          <w:lang w:bidi="he-IL"/>
+        </w:rPr>
+        <w:t xml:space="preserve"> }}</w:t>
       </w:r>
       <w:r>
         <w:rPr>
@@ -1638,7 +1901,27 @@
           <w:szCs w:val="26"/>
           <w:lang w:bidi="he-IL"/>
         </w:rPr>
-        <w:t>{{ ctx.surv_city }}</w:t>
+        <w:t xml:space="preserve">{{ </w:t>
+      </w:r>
+      <w:proofErr w:type="spellStart"/>
+      <w:r>
+        <w:rPr>
+          <w:rFonts w:ascii="Arial" w:hAnsi="Arial" w:cs="Arial"/>
+          <w:sz w:val="26"/>
+          <w:szCs w:val="26"/>
+          <w:lang w:bidi="he-IL"/>
+        </w:rPr>
+        <w:t>ctx.surv_city</w:t>
+      </w:r>
+      <w:proofErr w:type="spellEnd"/>
+      <w:r>
+        <w:rPr>
+          <w:rFonts w:ascii="Arial" w:hAnsi="Arial" w:cs="Arial"/>
+          <w:sz w:val="26"/>
+          <w:szCs w:val="26"/>
+          <w:lang w:bidi="he-IL"/>
+        </w:rPr>
+        <w:t xml:space="preserve"> }}</w:t>
       </w:r>
       <w:r>
         <w:rPr>
@@ -1676,6 +1959,35 @@
           <w:lang w:bidi="he-IL"/>
         </w:rPr>
       </w:pPr>
+      <w:r>
+        <w:rPr>
+          <w:rFonts w:ascii="Arial" w:hAnsi="Arial" w:cs="Arial"/>
+          <w:sz w:val="26"/>
+          <w:szCs w:val="26"/>
+          <w:rtl/>
+          <w:lang w:bidi="he-IL"/>
+        </w:rPr>
+        <w:t xml:space="preserve">{{ </w:t>
+      </w:r>
+      <w:r>
+        <w:rPr>
+          <w:rFonts w:ascii="Arial" w:hAnsi="Arial" w:cs="Arial"/>
+          <w:sz w:val="26"/>
+          <w:szCs w:val="26"/>
+          <w:lang w:bidi="he-IL"/>
+        </w:rPr>
+        <w:t>photo_s3</w:t>
+      </w:r>
+      <w:r>
+        <w:rPr>
+          <w:rFonts w:ascii="Arial" w:hAnsi="Arial" w:cs="Arial"/>
+          <w:sz w:val="26"/>
+          <w:szCs w:val="26"/>
+          <w:rtl/>
+          <w:lang w:bidi="he-IL"/>
+        </w:rPr>
+        <w:t xml:space="preserve"> }}</w:t>
+      </w:r>
     </w:p>
     <w:p>
       <w:pPr>

</xml_diff>